<commit_message>
added final changes and updated markdown file and writeup
</commit_message>
<xml_diff>
--- a/CSEN140_PR1_Writeup.docx
+++ b/CSEN140_PR1_Writeup.docx
@@ -16,7 +16,7 @@
         <w:pStyle w:val="IntenseQuote"/>
       </w:pPr>
       <w:r>
-        <w:t>How we built an 11-model k-NN ensemble for news classification — combining surface n-grams, latent semantic analysis (LSI), and pseudo-relevance feedback (PRF) — maximized GPU utilization on an RTX 5080, and iteratively refined score-level ensembling through trial and error. Final leaderboard score: 0.9587 (11-model, score-level + T=1.5). Local F1: 0.9245.</w:t>
+        <w:t>How we built a 13-model k-NN ensemble for news classification — combining surface n-grams, character n-grams, latent semantic analysis (LSI), and pseudo-relevance feedback (PRF) — maximized GPU utilization on an RTX 5080, and iteratively refined score-level ensembling through Powell-optimized weight search and cache-based validation. Final leaderboard score: 0.9608 (13-model, regularized 7-param Powell optimizer). Local F1: 0.9295.</w:t>
       </w:r>
     </w:p>
     <w:p>
@@ -362,6 +362,25 @@
     </w:p>
     <w:p>
       <w:pPr>
+        <w:pStyle w:val="Heading2"/>
+      </w:pPr>
+      <w:r>
+        <w:rPr>
+          <w:color w:val="2E74B5"/>
+        </w:rPr>
+        <w:t>2.6  Character N-gram Features</w:t>
+      </w:r>
+    </w:p>
+    <w:p>
+      <w:pPr>
+        <w:spacing w:after="120"/>
+      </w:pPr>
+      <w:r>
+        <w:t>Beyond word-level features, character n-grams capture sub-word morphology. By sliding a window of 3–5 characters over each word (with boundary markers), we generate features like "#sci", "scie", "cien", "ienc", "ence", "nce#" for "science". These features appear in "science", "scientific", and "scientist" — capturing morphological relationships that word-level models miss. Character n-grams are especially useful for distinguishing Business vs. Science/Tech vocabulary, where suffixes like "corp", "inc", "tech", "net" are class-discriminative at the character level.</w:t>
+      </w:r>
+    </w:p>
+    <w:p>
+      <w:pPr>
         <w:pStyle w:val="Heading1"/>
       </w:pPr>
       <w:r>
@@ -442,7 +461,26 @@
         <w:rPr>
           <w:color w:val="2E74B5"/>
         </w:rPr>
-        <w:t>3.2  Choosing k — The Journey</w:t>
+        <w:t>3.2  Similarity Power (sim_power)</w:t>
+      </w:r>
+    </w:p>
+    <w:p>
+      <w:pPr>
+        <w:spacing w:after="120"/>
+      </w:pPr>
+      <w:r>
+        <w:t>Beyond distance weighting, we raise each neighbor's cosine similarity to a power before accumulating votes: vote_weight = similarity ** sim_power. With sim_power=1.0 this is standard distance weighting. With sim_power=2.0 (our final setting), neighbors with higher similarity are amplified quadratically — a neighbor at 0.9 similarity gets 0.81 weight, while one at 0.5 gets only 0.25. This sharpens the voting so that very close neighbors dominate and distant neighbors contribute almost nothing. We swept sim_power ∈ {1.0, 1.5, 2.0, 3.0} and found 2.0 consistently best across models.</w:t>
+      </w:r>
+    </w:p>
+    <w:p>
+      <w:pPr>
+        <w:pStyle w:val="Heading2"/>
+      </w:pPr>
+      <w:r>
+        <w:rPr>
+          <w:color w:val="2E74B5"/>
+        </w:rPr>
+        <w:t>3.3  Choosing k — The Journey</w:t>
       </w:r>
     </w:p>
     <w:p>
@@ -495,7 +533,16 @@
         <w:ind w:left="576"/>
       </w:pPr>
       <w:r>
-        <w:t>Reverted: K_LIST = [11] + list(range(21, 42)) — the extended sweep caused overfitting on the leaderboard. Final version.</w:t>
+        <w:t>Reverted: K_LIST = [11] + list(range(21, 42)) — the extended sweep caused overfitting on the leaderboard.</w:t>
+      </w:r>
+    </w:p>
+    <w:p>
+      <w:pPr>
+        <w:pStyle w:val="ListBullet"/>
+        <w:ind w:left="576"/>
+      </w:pPr>
+      <w:r>
+        <w:t>Final (current): K_LIST = [1,3,5,7,9,11] + list(range(21,42)) + [51,71,101] — extended to K_MAX=101. Sparse models use this list; dense LSI models use K_LIST_DENSE = [11,21,31,41,51,71,101,151,201,251,301].</w:t>
       </w:r>
     </w:p>
     <w:p>
@@ -503,7 +550,7 @@
         <w:spacing w:after="120"/>
       </w:pPr>
       <w:r>
-        <w:t>We skip k=13–19 because experiments showed k=11 and the k=21–41 range tend to be optimal — the middle range often underperforms both. The range 21–41 is swept to find the exact best odd value (even k values can cause ties, so odd is preferred).</w:t>
+        <w:t>The extension to K_MAX=101 was motivated by the char n-gram and LSI models, which benefit from larger neighborhoods because their similarity scores are smoother. With cache-based validation (see Part 5.9), sweeping a wider k range adds no GPU cost — all sweeps run on cached top-K_MAX results in numpy.</w:t>
       </w:r>
     </w:p>
     <w:p>
@@ -514,7 +561,7 @@
         <w:rPr>
           <w:color w:val="1F497D"/>
         </w:rPr>
-        <w:t>PART 4 — THE ENSEMBLE: 11 MODELS</w:t>
+        <w:t>PART 4 — THE ENSEMBLE: 13 MODELS</w:t>
       </w:r>
     </w:p>
     <w:p>
@@ -530,7 +577,7 @@
         <w:spacing w:after="120"/>
       </w:pPr>
       <w:r>
-        <w:t>Each model is weighted by its validation F1 score, so stronger models have more influence in the final vote.</w:t>
+        <w:t>Each model's weight in the ensemble is determined by a Powell optimizer that directly maximizes validation macro F1. Stronger and more complementary models receive higher weight; redundant models are driven to zero.</w:t>
       </w:r>
     </w:p>
     <w:p>
@@ -541,7 +588,7 @@
         <w:rPr>
           <w:color w:val="2E74B5"/>
         </w:rPr>
-        <w:t>4.1  The 11 Final Models</w:t>
+        <w:t>4.1  The 13 Models</w:t>
       </w:r>
     </w:p>
     <w:p>
@@ -558,7 +605,7 @@
         <w:spacing w:after="120"/>
       </w:pPr>
       <w:r>
-        <w:t xml:space="preserve">    → Porter stemmer. The kitchen-sink model — largest feature set, includes trigrams. Started at vocab 200k / chi2(150k), expanded to 300k / 200k to capture more rare trigrams like "interest_rate_hike". Individual F1: ~0.9216.</w:t>
+        <w:t xml:space="preserve">    → Porter stemmer. The kitchen-sink model — largest feature set, includes trigrams. Started at vocab 200k / chi2(150k), expanded to 300k / 200k to capture more rare trigrams like "interest_rate_hike". Individual F1: ~0.9216. Highest weight in ensemble (w=0.3832).</w:t>
       </w:r>
     </w:p>
     <w:p>
@@ -575,7 +622,7 @@
         <w:spacing w:after="120"/>
       </w:pPr>
       <w:r>
-        <w:t xml:space="preserve">    → Porter stemmer. Same preprocessing as M1 but TF-IDF scoring, no trigrams. Individual F1: ~0.9169.</w:t>
+        <w:t xml:space="preserve">    → Porter stemmer. Same preprocessing as M1 but TF-IDF scoring, no trigrams. Individual F1: ~0.9174. Zeroed by Powell optimizer (redundant with M1/M3).</w:t>
       </w:r>
     </w:p>
     <w:p>
@@ -592,7 +639,7 @@
         <w:spacing w:after="120"/>
       </w:pPr>
       <w:r>
-        <w:t xml:space="preserve">    → Porter stemmer. Unigrams only — completely ignores phrase structure. Weakest individual model (~0.9135) but consistently helps the ensemble on the test set. We tried removing it — local ensemble improved slightly (0.9201→0.9204) but the leaderboard dropped (0.9574→0.9573). It captures something the other models miss.</w:t>
+        <w:t xml:space="preserve">    → Porter stemmer. Unigrams only — completely ignores phrase structure. Weakest individual model (~0.9135) but contributes in the ensemble (w=0.1393). We tried removing it — local improved slightly but leaderboard dropped. Captures something the other models miss.</w:t>
       </w:r>
     </w:p>
     <w:p>
@@ -609,7 +656,7 @@
         <w:spacing w:after="120"/>
       </w:pPr>
       <w:r>
-        <w:t xml:space="preserve">    → Porter stemmer. Like M1 but no trigrams, smaller feature set. Individual F1: ~0.9180.</w:t>
+        <w:t xml:space="preserve">    → Porter stemmer. Like M1 but no trigrams, smaller feature set. Individual F1: ~0.9180. Zeroed by Powell optimizer.</w:t>
       </w:r>
     </w:p>
     <w:p>
@@ -626,7 +673,7 @@
         <w:spacing w:after="120"/>
       </w:pPr>
       <w:r>
-        <w:t xml:space="preserve">    → WordNet lemmatizer. Same scoring as M4 but dictionary-form normalization instead of heuristic stemming. Individual F1: ~0.9178.</w:t>
+        <w:t xml:space="preserve">    → WordNet lemmatizer. Same scoring as M4 but dictionary-form normalization instead of heuristic stemming. Individual F1: ~0.9178. Zeroed by Powell optimizer.</w:t>
       </w:r>
     </w:p>
     <w:p>
@@ -643,7 +690,7 @@
         <w:spacing w:after="120"/>
       </w:pPr>
       <w:r>
-        <w:t xml:space="preserve">    → Raw words — NO stemming or lemmatizing. Keeps "stocks", "markets", "running" as-is. Completely different vocabulary from M1–M5. Individual F1: ~0.9181.</w:t>
+        <w:t xml:space="preserve">    → Raw words — NO stemming or lemmatizing. Keeps "stocks", "markets", "running" as-is. Completely different vocabulary from M1–M5. Individual F1: ~0.9181. Zeroed by Powell optimizer despite good standalone performance.</w:t>
       </w:r>
     </w:p>
     <w:p>
@@ -660,7 +707,7 @@
         <w:spacing w:after="120"/>
       </w:pPr>
       <w:r>
-        <w:t xml:space="preserve">    → WordNet lemmatizer + TF-IDF scoring. Combines M5's preprocessing with M2's scoring. Individual F1: ~0.9170.</w:t>
+        <w:t xml:space="preserve">    → WordNet lemmatizer + TF-IDF scoring. Combines M5's preprocessing with M2's scoring. Individual F1: ~0.9172. Zeroed by Powell optimizer.</w:t>
       </w:r>
     </w:p>
     <w:p>
@@ -677,7 +724,7 @@
         <w:spacing w:after="120"/>
       </w:pPr>
       <w:r>
-        <w:t xml:space="preserve">    → Porter stemmer + TF-IDF scoring. The trigram counterpart to M1 — same features, different scoring function. BM25 and TF-IDF handle term frequency saturation differently, so they disagree on borderline documents and complement each other. Individual F1: ~0.9209. Adding M8 pushed ensemble from 0.9203 → 0.9211.</w:t>
+        <w:t xml:space="preserve">    → Porter stemmer + TF-IDF scoring. The trigram counterpart to M1 — same features, different scoring function. Individual F1: ~0.9209. Zeroed by Powell optimizer (its signal appears captured by M1 + M12 combination).</w:t>
       </w:r>
     </w:p>
     <w:p>
@@ -694,7 +741,7 @@
         <w:spacing w:after="120"/>
       </w:pPr>
       <w:r>
-        <w:t xml:space="preserve">    → First latent-semantic model. Takes the pre-chi2 TF-IDF trigram matrix and reduces it to 300 dense dimensions via randomized truncated SVD. Captures latent topic structure — synonyms and topically-related terms end up close in the reduced space even when they never co-occur in the same document. Operates in a fundamentally different representation than M1–M8 (dense 300-dim vs. sparse 100k+). Explained variance: ~0.10. Individual F1: ~0.8813 (lower solo — 300 dims cannot match 200k rich n-gram features), but adds ensemble diversity.</w:t>
+        <w:t xml:space="preserve">    → First latent-semantic model. Takes the pre-chi2 TF-IDF trigram matrix and reduces it to 300 dense dimensions via randomized truncated SVD. Captures latent topic structure — synonyms and topically-related terms end up close in the reduced space even when they never co-occur in the same document. Individual F1: ~0.8813. Active in ensemble (w=0.0284).</w:t>
       </w:r>
     </w:p>
     <w:p>
@@ -711,7 +758,7 @@
         <w:spacing w:after="120"/>
       </w:pPr>
       <w:r>
-        <w:t xml:space="preserve">    → Second latent-semantic model. Same SVD-300 reduction but applied to BM25-scored features instead of TF-IDF. BM25's saturation function emphasizes different term-document structure, so the latent topics SVD extracts are slightly different. Individual F1: ~0.8860. Adds marginal diversity over M9 — the two LSI models are somewhat correlated since they operate on similar underlying n-gram space.</w:t>
+        <w:t xml:space="preserve">    → Second latent-semantic model. Same SVD-300 reduction but applied to BM25-scored features instead of TF-IDF. BM25's saturation function emphasizes different term-document structure, so the latent topics SVD extracts are slightly different. Individual F1: ~0.8876. Active in ensemble (w=0.1335) — the optimizer assigns it substantially more weight than M9 because BM25-based LSI topics are cleaner.</w:t>
       </w:r>
     </w:p>
     <w:p>
@@ -728,7 +775,16 @@
         <w:spacing w:after="120"/>
       </w:pPr>
       <w:r>
-        <w:t xml:space="preserve">    → Rocchio-style query expansion. For each query, the first k-NN pass finds the top-N nearest neighbors (similarity-weighted), the query is replaced by alpha*query + beta*centroid(top-N neighbors), and a second k-NN pass retrieves against the expanded query. Conservative tuning (alpha=0.9, beta=0.1, N=10) was required — aggressive values (alpha=0.7, beta=0.3, N=20) caused query drift to wrong-class clusters. Individual F1: ~0.9202 (just below M1's 0.9216 — PRF does not improve M1 solo, but the 2nd-pass k-NN produces different enough predictions to help the ensemble).</w:t>
+        <w:t xml:space="preserve">    → Rocchio-style query expansion. For each query, the first k-NN pass finds the top-N nearest neighbors (similarity-weighted), the query is replaced by alpha*query + beta*centroid(top-N neighbors), and a second k-NN pass retrieves against the expanded query. Conservative tuning (alpha=0.9, beta=0.1, N=10) was required — aggressive values (alpha=0.7, beta=0.3, N=20) caused query drift to wrong-class clusters. Individual F1: ~0.9202. Active in ensemble (w=0.0382).</w:t>
+      </w:r>
+    </w:p>
+    <w:p>
+      <w:r>
+        <w:rPr>
+          <w:b/>
+          <w:sz w:val="22"/>
+        </w:rPr>
+        <w:t>M12: TF-IDF + character 3–5-grams + chi2, vocab ~150k</w:t>
       </w:r>
     </w:p>
     <w:p>
@@ -736,7 +792,32 @@
         <w:spacing w:after="120"/>
       </w:pPr>
       <w:r>
-        <w:t>The key insight: every model uses a different combination of (preprocessing × scoring × n-gram order × reduction × query transformation). When they disagree, the ensemble votes. When they all agree, confidence is high. The diversity is what makes ensembles work.</w:t>
+        <w:t xml:space="preserve">    → Character n-gram model. Slides a window of 3, 4, and 5 characters over each word with boundary markers (e.g. "#sci", "scie", "cien", "ence", "nce#") and builds a TF-IDF weighted bag of character n-grams. Captures morphological patterns across word forms — "scien" appears in "science", "scientific", "scientist". Completely different representation from all word-level models. Individual F1: ~0.9111 (below word models solo, but highly complementary). Second highest ensemble weight (w=0.1364).</w:t>
+      </w:r>
+    </w:p>
+    <w:p>
+      <w:r>
+        <w:rPr>
+          <w:b/>
+          <w:sz w:val="22"/>
+        </w:rPr>
+        <w:t>M13: LSI (TruncatedSVD, 300 dims) on char n-gram matrix</w:t>
+      </w:r>
+    </w:p>
+    <w:p>
+      <w:pPr>
+        <w:spacing w:after="120"/>
+      </w:pPr>
+      <w:r>
+        <w:t xml:space="preserve">    → Latent-semantic analysis applied to the character n-gram space. SVD-300 on the M12 feature matrix produces a dense 300-dim topic signature in character-space. Captures latent morphological structure — related character patterns compress into shared topic dimensions. Individual F1: ~0.8902. Highest ensemble weight after M1 (w=0.1410) — the optimizer discovered that char-level LSI is more complementary to the word-level models than word-level LSI (M9/M10), because it operates on a fundamentally different feature space.</w:t>
+      </w:r>
+    </w:p>
+    <w:p>
+      <w:pPr>
+        <w:spacing w:after="120"/>
+      </w:pPr>
+      <w:r>
+        <w:t>The key insight: every model uses a different combination of (preprocessing × scoring × n-gram order × feature space × reduction × query transformation). When they disagree, the ensemble votes. The diversity is what makes ensembles work — M12's char n-grams and M13's char-space LSI add signal that no word-level model can replicate.</w:t>
       </w:r>
     </w:p>
     <w:p>
@@ -747,7 +828,7 @@
         <w:rPr>
           <w:color w:val="2E74B5"/>
         </w:rPr>
-        <w:t>4.2  Latent Semantic Indexing (LSI) — M9 and M10</w:t>
+        <w:t>4.2  Latent Semantic Indexing (LSI) — M9, M10, M13</w:t>
       </w:r>
     </w:p>
     <w:p>
@@ -755,7 +836,7 @@
         <w:spacing w:after="120"/>
       </w:pPr>
       <w:r>
-        <w:t>M1–M8 all operate in sparse n-gram space. Two documents that discuss the same topic using different words (e.g. "stocks rise" vs "shares climb") may share very few n-grams and look dissimilar despite meaning the same thing. LSI addresses this: Truncated Singular Value Decomposition (SVD) factors the term-document matrix into a much smaller dense representation where each dimension captures a latent topic — a weighted combination of terms that tend to co-occur.</w:t>
+        <w:t>Three models operate via LSI (Truncated SVD). M1–M8 and M12 operate in sparse n-gram or char-gram space. Two documents that discuss the same topic using different words (e.g. "stocks rise" vs "shares climb") may share very few n-grams and look dissimilar despite meaning the same thing. LSI addresses this: Truncated Singular Value Decomposition (SVD) factors the term-document matrix into a much smaller dense representation where each dimension captures a latent topic — a weighted combination of terms that tend to co-occur.</w:t>
       </w:r>
     </w:p>
     <w:p>
@@ -763,7 +844,7 @@
         <w:spacing w:after="120"/>
       </w:pPr>
       <w:r>
-        <w:t>Concretely, for M9 we take the TF-IDF + trigram matrix (102080 × 300000) and compute a rank-300 randomized SVD, producing a 102080 × 300 dense matrix. Each row is a 300-dim topic signature of the document. After L2-normalization, cosine similarity (dot product) in this dense space captures semantic closeness rather than surface word overlap. k-NN in the reduced space runs via dense GPU matmul — no sparse math needed since 300 dims × 4 bytes × 102k docs is only 120 MB on the GPU.</w:t>
+        <w:t>M9 takes the TF-IDF + trigram matrix and computes a rank-300 randomized SVD, producing a dense matrix where each row is a 300-dim topic signature. M10 applies the same SVD to the BM25 matrix — the latent topics differ slightly because BM25's saturation function changes which term-document entries dominate. M13 applies SVD-300 to the character n-gram matrix — a third distinct topic space based on morphological rather than lexical structure.</w:t>
       </w:r>
     </w:p>
     <w:p>
@@ -771,7 +852,7 @@
         <w:spacing w:after="120"/>
       </w:pPr>
       <w:r>
-        <w:t>Why 300 dimensions? A sweet spot: small enough that topics are meaningful and retrieval is fast, large enough to preserve class structure. Larger components (500, 1000) add marginal signal but also noise. The explained-variance ratio for M9 was ~0.10 — 10% of the total variance captured in 300 dims — low by classic LSI standards because news text has very long-tailed vocabulary, but the retained variance is the class-discriminative part, which is what matters.</w:t>
+        <w:t>Why 300 dimensions? A sweet spot: small enough that topics are meaningful and retrieval is fast, large enough to preserve class structure. We tried SVD-500 for M9/M10 and SVD-600 for additional models — both hurt leaderboard performance. More components add noise along with signal, and the optimizer overfits to the additional parameters. All LSI models stay at SVD-300.</w:t>
       </w:r>
     </w:p>
     <w:p>
@@ -779,15 +860,7 @@
         <w:spacing w:after="120"/>
       </w:pPr>
       <w:r>
-        <w:t>M9 alone scores 0.8813, clearly below M1–M8's sparse models. That is expected: 300 latent dims cannot rival 200k explicit features for nearest-neighbor retrieval on this dataset. The value of LSI is purely ensemble diversity — it makes different mistakes than the sparse models because its similarity metric is fundamentally different.</w:t>
-      </w:r>
-    </w:p>
-    <w:p>
-      <w:pPr>
-        <w:spacing w:after="120"/>
-      </w:pPr>
-      <w:r>
-        <w:t>M10 is the same approach applied to the BM25 matrix instead of TF-IDF. It scores 0.8860 solo — slightly better than M9 because BM25's saturation produces a cleaner topic structure. But the gain over M9 in the ensemble was marginal (+0.0001), because both LSI views cover similar latent space. One LSI model is probably sufficient; two was a small bonus.</w:t>
+        <w:t>M9 alone scores 0.8813, clearly below the sparse models. M10 scores 0.8876 solo. M13 scores 0.8902. The value of these models is purely ensemble diversity — they make different mistakes from the sparse models because their similarity metric is fundamentally different. The optimizer confirms this: M13's ensemble weight (0.1410) exceeds M10's (0.1335) and far exceeds M9's (0.0284) — char-space LSI is the most complementary of the three.</w:t>
       </w:r>
     </w:p>
     <w:p>
@@ -844,15 +917,7 @@
         <w:spacing w:after="120"/>
       </w:pPr>
       <w:r>
-        <w:t>We tuned to conservative drift (alpha=0.9, beta=0.1, N=10): the original query dominates, and only the 10 closest neighbors contribute a small nudge. M11 rose to 0.9202 solo (still slightly below M1's 0.9216 — PRF does not improve M1 directly), but the ensemble climbed from 0.9240 → 0.9245. The 2-pass k-NN produces predictions that are just different enough from M1 to contribute diversity, even though M11 is worse on its own. Classic ensemble behavior.</w:t>
-      </w:r>
-    </w:p>
-    <w:p>
-      <w:pPr>
-        <w:spacing w:after="120"/>
-      </w:pPr>
-      <w:r>
-        <w:t>Why PRF barely helped: news article texts are relatively clean and topically coherent already. Query expansion shines when queries are short, ambiguous, or out-of-distribution — conditions this corpus does not match. Still, the small gain is real and directly attributable to PRF's distinct retrieval mechanism.</w:t>
+        <w:t>We tuned to conservative drift (alpha=0.9, beta=0.1, N=10): the original query dominates, and only the 10 closest neighbors contribute a small nudge. M11 rose to 0.9202 solo (still slightly below M1's 0.9216 — PRF does not improve M1 directly), but the ensemble climbed. The 2-pass k-NN produces predictions that are just different enough from M1 to contribute diversity.</w:t>
       </w:r>
     </w:p>
     <w:p>
@@ -863,7 +928,7 @@
         <w:rPr>
           <w:color w:val="2E74B5"/>
         </w:rPr>
-        <w:t>4.4  Models We Tried and Removed</w:t>
+        <w:t>4.4  Char N-gram Models (M12 and M13)</w:t>
       </w:r>
     </w:p>
     <w:p>
@@ -871,7 +936,42 @@
         <w:spacing w:after="120"/>
       </w:pPr>
       <w:r>
-        <w:t>Not every model made the final ensemble. One was added and removed after leaderboard testing:</w:t>
+        <w:t>M12 and M13 operate below the word level, on character sequences. For each word, we generate all character n-grams of length 3, 4, and 5, with boundary markers (#) prepended and appended. For "science": "#sc", "sci", "cie", "ien", "enc", "nce", "ce#", "#sci", "scie", "cien", "ienc", "ence", "nce#", "#scie", "scien", "cienc", "ience", "ence#", etc. These character sequences appear across inflected forms of the same root word, capturing morphological family relationships that word n-grams miss.</w:t>
+      </w:r>
+    </w:p>
+    <w:p>
+      <w:pPr>
+        <w:spacing w:after="120"/>
+      </w:pPr>
+      <w:r>
+        <w:t>Why char n-grams help on this specific dataset: the 4-class confusion is dominated by Business (class 3) vs Science/Tech (class 4). These classes share many words but differ in morphological patterns — "corporation", "incorporated", "quarterly" vs "technology", "processor", "bandwidth". Character n-grams pick up these suffixes ("corp", "inc", "quar" vs "tech", "cess", "widt") without requiring exact word matches.</w:t>
+      </w:r>
+    </w:p>
+    <w:p>
+      <w:pPr>
+        <w:spacing w:after="120"/>
+      </w:pPr>
+      <w:r>
+        <w:t>M12 (sparse TF-IDF char n-grams) has standalone F1=0.9111 — below all word models except M9/M10/M13. But its ensemble weight (0.1364) is the second highest after M1. M13 (LSI-300 on char n-grams) has F1=0.8902 standalone but the highest weight of all models except M1 (0.1410). The optimizer's preference for these models reveals that their errors are the most decorrelated from the word-level models — they are the most complementary models in the ensemble despite weaker standalone performance.</w:t>
+      </w:r>
+    </w:p>
+    <w:p>
+      <w:pPr>
+        <w:pStyle w:val="Heading2"/>
+      </w:pPr>
+      <w:r>
+        <w:rPr>
+          <w:color w:val="2E74B5"/>
+        </w:rPr>
+        <w:t>4.5  Models We Tried and Removed</w:t>
+      </w:r>
+    </w:p>
+    <w:p>
+      <w:pPr>
+        <w:spacing w:after="120"/>
+      </w:pPr>
+      <w:r>
+        <w:t>Not every model made the final ensemble. Several were added and removed after testing:</w:t>
       </w:r>
     </w:p>
     <w:p>
@@ -888,7 +988,16 @@
         <w:spacing w:after="120"/>
       </w:pPr>
       <w:r>
-        <w:t xml:space="preserve">    → Extracted character sequences from stemmed words using boundary markers: "science" → "#sc", "sci", "cie", "ien", "enc", "nce", "ce#", "scie", "cien", "ienc", "ence", "nce#". Captures morphological patterns across word forms — "scien" appears in "science", "scientific", "scientist" — that no word-level model can see. This was the only model operating below the word level.</w:t>
+        <w:t xml:space="preserve">    → Extracted character sequences from stemmed words using boundary markers. Local ensemble improved from 0.9201 → 0.9212 (best local score yet). But leaderboard dropped from 0.9570 → 0.9567. Classic overfitting to the validation split. Removed permanently. (Later replaced by M12 with better char n-gram design.)</w:t>
+      </w:r>
+    </w:p>
+    <w:p>
+      <w:r>
+        <w:rPr>
+          <w:b/>
+          <w:sz w:val="22"/>
+        </w:rPr>
+        <w:t>M15/M16/M17: SVD-600 upgrades of M10/M9/M13</w:t>
       </w:r>
     </w:p>
     <w:p>
@@ -896,7 +1005,58 @@
         <w:spacing w:after="120"/>
       </w:pPr>
       <w:r>
-        <w:t xml:space="preserve">    → Result: Local ensemble improved from 0.9201 → 0.9212 (best local score yet). But leaderboard dropped from 0.9570 → 0.9567. Classic overfitting to the validation split — the char n-gram features were highly tuned to the 20% validation set but did not generalize to the held-out test set. Removed permanently.</w:t>
+        <w:t xml:space="preserve">    → Attempted to improve the LSI models by doubling the SVD dimensions from 300 to 600. Local F1 was 0.9290 (marginal drop from 0.9292 baseline). Leaderboard dropped from 0.9607 to 0.9596 — a clear hurt. SVD-600 adds noise along with signal at this corpus size. Removed permanently. All LSI models stay at SVD-300.</w:t>
+      </w:r>
+    </w:p>
+    <w:p>
+      <w:r>
+        <w:rPr>
+          <w:b/>
+          <w:sz w:val="22"/>
+        </w:rPr>
+        <w:t>Centroid Models C-M1/C-M8/C-M12: per-class centroid k-NN</w:t>
+      </w:r>
+    </w:p>
+    <w:p>
+      <w:pPr>
+        <w:spacing w:after="120"/>
+      </w:pPr>
+      <w:r>
+        <w:t xml:space="preserve">    → Built per-class centroid vectors (average of all training documents in each class) and used them as additional "anchor" models. Local F1 improved marginally (0.9292 → 0.9294). Leaderboard dropped from 0.9607 to 0.9599. The centroid models are too correlated with the full k-NN models to add new signal. Not in active ensemble.</w:t>
+      </w:r>
+    </w:p>
+    <w:p>
+      <w:r>
+        <w:rPr>
+          <w:b/>
+          <w:sz w:val="22"/>
+        </w:rPr>
+        <w:t>M18: Asymmetric BM25 (raw-TF query vs BM25 document)</w:t>
+      </w:r>
+    </w:p>
+    <w:p>
+      <w:pPr>
+        <w:spacing w:after="120"/>
+      </w:pPr>
+      <w:r>
+        <w:t xml:space="preserve">    → Applied BM25 weighting to training documents but used raw term frequencies for test queries (asymmetric scoring). Standalone F1=0.9208 — below M1's 0.9216. Shares the same chi2 feature space as M1, so adds no new signal. Not worth the additional optimizer parameter cost. Not added.</w:t>
+      </w:r>
+    </w:p>
+    <w:p>
+      <w:r>
+        <w:rPr>
+          <w:b/>
+          <w:sz w:val="22"/>
+        </w:rPr>
+        <w:t>M19: 3vs4 discriminative chi2 vocabulary</w:t>
+      </w:r>
+    </w:p>
+    <w:p>
+      <w:pPr>
+        <w:spacing w:after="120"/>
+      </w:pPr>
+      <w:r>
+        <w:t xml:space="preserve">    → Attempted to build a model with features selected specifically to discriminate class 3 (Business) from class 4 (Sci/Tech) — the dominant source of confusion. Computed chi2 on a binary class-3-vs-4 subset, then projected all 4-class documents to those features. Complete failure: standalone F1=0.3628. Root cause: class 1/2 documents have incidental business/tech vocabulary that, when amplified by L2 normalization in a business/tech-focused feature space, scatters them randomly. The model predicted only class 3/4 for everything. Do NOT try pairwise-focused feature selection for a 4-class k-NN model.</w:t>
       </w:r>
     </w:p>
     <w:p>
@@ -907,7 +1067,7 @@
         <w:rPr>
           <w:color w:val="2E74B5"/>
         </w:rPr>
-        <w:t>4.5  Ensemble Weighting Experiments</w:t>
+        <w:t>4.6  Ensemble Weighting: From F1 Weights to Powell Optimizer</w:t>
       </w:r>
     </w:p>
     <w:p>
@@ -915,7 +1075,15 @@
         <w:spacing w:after="120"/>
       </w:pPr>
       <w:r>
-        <w:t>We also experimented with how to weight the models in the ensemble vote:</w:t>
+        <w:t>Early in the project, model weights in the ensemble were simply set proportional to each model's validation F1 score. This is intuitive — stronger models get more influence — but it ignores the complementarity between models. Two models with identical F1 but decorrelated errors are worth more together than two high-F1 models that always agree.</w:t>
+      </w:r>
+    </w:p>
+    <w:p>
+      <w:pPr>
+        <w:spacing w:after="120"/>
+      </w:pPr>
+      <w:r>
+        <w:t>Early weighting experiments before the optimizer:</w:t>
       </w:r>
     </w:p>
     <w:p>
@@ -924,7 +1092,7 @@
         <w:ind w:left="576"/>
       </w:pPr>
       <w:r>
-        <w:t>Linear F1 weights (current): w = best_f1_mX. Simple and robust. Gives models proportional influence based on their validation performance.</w:t>
+        <w:t>Linear F1 weights: w = best_f1_mX. Simple and robust. Proportional influence based on validation performance.</w:t>
       </w:r>
     </w:p>
     <w:p>
@@ -933,7 +1101,58 @@
         <w:ind w:left="576"/>
       </w:pPr>
       <w:r>
-        <w:t>Squared F1 weights (tried, reverted): w = best_f1_mX ** 2. Intended to amplify stronger models more aggressively. Made zero difference in practice — the individual F1 scores are too tightly clustered (0.913–0.922) for squaring to actually flip any votes. Reverted.</w:t>
+        <w:t>Squared F1 weights (tried, reverted): w = best_f1_mX ** 2. Intended to amplify stronger models more aggressively. Made zero difference — the individual F1 scores are too tightly clustered (0.88–0.92) for squaring to flip any votes. Reverted.</w:t>
+      </w:r>
+    </w:p>
+    <w:p>
+      <w:pPr>
+        <w:spacing w:after="120"/>
+      </w:pPr>
+      <w:r>
+        <w:t>The major upgrade was replacing F1-based weights with a Powell optimizer. scipy.optimize.minimize(method="Powell") directly maximizes validation macro F1 by searching the 13-dimensional weight space. The objective function is cheap because it runs on cached top-K_MAX scores (no GPU) — each evaluation is pure numpy matrix operations. With ~1000 optimizer evaluations feasible per minute, the optimizer thoroughly explores the weight space and finds complementarity patterns that F1 weights cannot capture.</w:t>
+      </w:r>
+    </w:p>
+    <w:p>
+      <w:pPr>
+        <w:spacing w:after="80"/>
+        <w:ind w:left="576"/>
+      </w:pPr>
+      <w:r>
+        <w:rPr>
+          <w:rFonts w:ascii="Courier New" w:hAnsi="Courier New"/>
+          <w:color w:val="000080"/>
+          <w:sz w:val="18"/>
+        </w:rPr>
+        <w:t>def objective(weights):</w:t>
+        <w:br/>
+        <w:t xml:space="preserve">    weights = np.maximum(weights, 0)          # no negative weights</w:t>
+        <w:br/>
+        <w:t xml:space="preserve">    weights = weights / weights.sum()          # normalize to simplex</w:t>
+        <w:br/>
+        <w:t xml:space="preserve">    combined = sum(w * scores for w, scores in zip(weights, score_list_v[:13]))</w:t>
+        <w:br/>
+        <w:t xml:space="preserve">    preds = CLASS_LABELS[combined.argmax(axis=1)]</w:t>
+        <w:br/>
+        <w:t xml:space="preserve">    return -f1_score(val_labels, preds, average="macro")</w:t>
+        <w:br/>
+        <w:br/>
+        <w:t>result = minimize(objective, x0=initial_weights, method="Powell")</w:t>
+      </w:r>
+    </w:p>
+    <w:p>
+      <w:pPr>
+        <w:spacing w:after="120"/>
+      </w:pPr>
+      <w:r>
+        <w:t>The optimizer immediately zeroed out M2/M4/M5/M6/M7/M8 — finding that these models' signal is fully subsumed by M1, M3, M12, and M13. The active weights in the final regularized 7-param run are: M1=0.3832, M3=0.1393, M10=0.1335, M12=0.1364, M13=0.1410, M11=0.0382, M9=0.0284.</w:t>
+      </w:r>
+    </w:p>
+    <w:p>
+      <w:pPr>
+        <w:spacing w:after="120"/>
+      </w:pPr>
+      <w:r>
+        <w:t>Regularization: after discovering that the optimizer drives M2–M8 to zero, we fixed those weights at zero and ran the optimizer on only 7 free parameters (M1/M3/M9/M10/M11/M12/M13). Fewer parameters means less optimizer overfitting to the validation split. Local F1: 0.9295 (same as 13-param), LB: 0.9608 (+0.0001 over 13-param run). The regularization helped generalization.</w:t>
       </w:r>
     </w:p>
     <w:p>
@@ -944,7 +1163,7 @@
         <w:rPr>
           <w:color w:val="2E74B5"/>
         </w:rPr>
-        <w:t>4.6  Score-Level Ensembling (Soft Probabilities)</w:t>
+        <w:t>4.7  Score-Level Ensembling (Soft Probabilities)</w:t>
       </w:r>
     </w:p>
     <w:p>
@@ -952,15 +1171,7 @@
         <w:spacing w:after="120"/>
       </w:pPr>
       <w:r>
-        <w:t>After adding M9 and M10, we realized the hard-vote ensemble was throwing away information. The original scheme was: each model produced a single predicted class, and those class votes were summed weighted by F1. That collapses each model's confidence — a model that is 95% sure of class 2 and a model that is 51% sure of class 3 both cast a single vote of equal magnitude.</w:t>
-      </w:r>
-    </w:p>
-    <w:p>
-      <w:pPr>
-        <w:spacing w:after="120"/>
-      </w:pPr>
-      <w:r>
-        <w:t>The fix: have each model return per-class similarity sums (shape n_test × 4) before argmax. L1-normalize each row to turn the sums into a probability distribution, weight-sum across models by their F1 scores, then argmax the combined probabilities. Confident models now contribute more to the decision than unsure ones, on a per-query basis.</w:t>
+        <w:t>The ensemble combines models at the score level, not the label level. Each model returns per-class similarity sums (shape n_test × 4) before argmax. L1-normalize each row to turn the sums into a probability distribution, weight-sum across models by their optimizer weights, then argmax the combined probabilities. Confident models now contribute more to the decision than unsure ones, on a per-query basis.</w:t>
       </w:r>
     </w:p>
     <w:p>
@@ -978,7 +1189,7 @@
         <w:br/>
         <w:t>combined = sum(w_m * probs_m for m in models)        # weighted soft vote</w:t>
         <w:br/>
-        <w:t>predictions = argmax(combined, axis=1)</w:t>
+        <w:t>predictions = CLASS_LABELS[argmax(combined, axis=1)]</w:t>
       </w:r>
     </w:p>
     <w:p>
@@ -986,7 +1197,7 @@
         <w:spacing w:after="120"/>
       </w:pPr>
       <w:r>
-        <w:t>Jump: 0.9220 → 0.9240 (+0.0020). Bigger gain than adding any individual model at that point. Implementing this required new helpers — knn_predict_scores and knn_predict_dense_scores — which return the per-class sum matrix instead of hard labels. Vectorized via a mask-and-sum idiom for speed: scores[:, c] = (top_sims * (top_labels == c)).sum(axis=1) — one matmul-free operation per class.</w:t>
+        <w:t>With sim_power=2.0, similarity scores are raised to the second power before accumulation — amplifying high-confidence neighbors and suppressing noise. This is applied per-model before L1 normalization, so each model's probability distribution already reflects the sharpened similarity landscape.</w:t>
       </w:r>
     </w:p>
     <w:p>
@@ -997,7 +1208,7 @@
         <w:rPr>
           <w:color w:val="2E74B5"/>
         </w:rPr>
-        <w:t>4.7  Temperature Sharpening Experiment</w:t>
+        <w:t>4.8  Temperature Sharpening Sweep</w:t>
       </w:r>
     </w:p>
     <w:p>
@@ -1005,7 +1216,7 @@
         <w:spacing w:after="120"/>
       </w:pPr>
       <w:r>
-        <w:t>A natural extension of score-level ensembling: raise each model's probability distribution to a power T before combining. T=1 preserves the distribution; T &gt; 1 sharpens it (confident models dominate, unsure models contribute less); T &lt; 1 flattens it. This is equivalent to a tempered softmax.</w:t>
+        <w:t>A natural extension of score-level ensembling: raise each model's probability distribution to a power T before combining. T=1 preserves the distribution; T &gt; 1 sharpens it; T &lt; 1 flattens it.</w:t>
       </w:r>
     </w:p>
     <w:p>
@@ -1022,7 +1233,7 @@
         <w:ind w:left="576"/>
       </w:pPr>
       <w:r>
-        <w:t>At 10 models (before M11): T=1.0 and T=2.0 both hit 0.9240 exactly. Higher T hurt. No meaningful gain.</w:t>
+        <w:t>At 10 models (before M11): T=1.0 and T=2.0 both hit 0.9240 exactly. Higher T hurt.</w:t>
       </w:r>
     </w:p>
     <w:p>
@@ -1031,7 +1242,16 @@
         <w:ind w:left="576"/>
       </w:pPr>
       <w:r>
-        <w:t>At 11 models (after M11): T=1.5 became best at 0.9245, marginally above T=1.0.</w:t>
+        <w:t>At 11 models (after M11): T=1.5 became marginally best at 0.9245.</w:t>
+      </w:r>
+    </w:p>
+    <w:p>
+      <w:pPr>
+        <w:pStyle w:val="ListBullet"/>
+        <w:ind w:left="576"/>
+      </w:pPr>
+      <w:r>
+        <w:t>At 13 models (after M12/M13 + Powell weights): T=1.0 is best. Sharpening hurts.</w:t>
       </w:r>
     </w:p>
     <w:p>
@@ -1039,7 +1259,7 @@
         <w:spacing w:after="120"/>
       </w:pPr>
       <w:r>
-        <w:t>Interpretation: the F1 weights are already doing the right calibration. Sharpening trades diversity for confidence, which only helps when the weakest models are adding noise the weights are not filtering out. At 11 models with F1 weights in [0.88, 0.92], the system is near-optimal as-is.</w:t>
+        <w:t>Interpretation: with Powell-optimized weights (not F1 weights), the weight calibration is already sharp and accurate. The optimizer has found the right balance. Additional temperature sharpening just trades diversity for confidence without net benefit. Final config: T=1.0.</w:t>
       </w:r>
     </w:p>
     <w:p>
@@ -1069,7 +1289,7 @@
         <w:spacing w:after="120"/>
       </w:pPr>
       <w:r>
-        <w:t>The core operation in k-NN is: for each test document, compute its similarity to ALL 100,000+ training documents. With 25,520 test documents and 102,080 training documents, that is 2.6 billion similarity computations per model, per k value. We sweep 22 values of k per model, across 8 models — the total is enormous. On CPU this would take many hours. On GPU it takes minutes.</w:t>
+        <w:t>The core operation in k-NN is: for each test document, compute its similarity to ALL 100,000+ training documents. With 25,520 test documents and 102,080 training documents, that is 2.6 billion similarity computations per model, per k value. We sweep many values of k per model, across 13 models — the total is enormous. On CPU this would take many hours. On GPU it takes minutes.</w:t>
       </w:r>
     </w:p>
     <w:p>
@@ -1414,14 +1634,6 @@
     </w:p>
     <w:p>
       <w:pPr>
-        <w:spacing w:after="120"/>
-      </w:pPr>
-      <w:r>
-        <w:t>With this fix, lighter models (M1–M7, ~200–300 non-zeros per doc) became CPU-bound at ~90% CPU utilization — meaning the CPU was now the bottleneck, which is expected and acceptable. The denser char n-gram model was GPU-bound. Both are the correct behavior for their respective densities.</w:t>
-      </w:r>
-    </w:p>
-    <w:p>
-      <w:pPr>
         <w:pStyle w:val="Heading2"/>
       </w:pPr>
       <w:r>
@@ -1479,6 +1691,73 @@
     </w:p>
     <w:p>
       <w:pPr>
+        <w:pStyle w:val="Heading2"/>
+      </w:pPr>
+      <w:r>
+        <w:rPr>
+          <w:color w:val="2E74B5"/>
+        </w:rPr>
+        <w:t>5.9  Cache-Based Validation — ~30x Speedup for k and Weight Sweeps</w:t>
+      </w:r>
+    </w:p>
+    <w:p>
+      <w:pPr>
+        <w:spacing w:after="120"/>
+      </w:pPr>
+      <w:r>
+        <w:t>A key optimization added later in the project: instead of running a GPU k-NN pass for every k value in K_LIST, we run a SINGLE GPU pass that retrieves the top-K_MAX neighbors for each query and caches their labels and similarities. All k-sweep evaluations then run in pure numpy by slicing the cached top-K_MAX results:</w:t>
+      </w:r>
+    </w:p>
+    <w:p>
+      <w:pPr>
+        <w:spacing w:after="80"/>
+        <w:ind w:left="576"/>
+      </w:pPr>
+      <w:r>
+        <w:rPr>
+          <w:rFonts w:ascii="Courier New" w:hAnsi="Courier New"/>
+          <w:color w:val="000080"/>
+          <w:sz w:val="18"/>
+        </w:rPr>
+        <w:t>def knn_cache_topk(train_mat, test_mat, train_labels, K_MAX):</w:t>
+        <w:br/>
+        <w:t xml:space="preserve">    # ONE GPU pass: retrieve top-K_MAX neighbors for all test docs</w:t>
+        <w:br/>
+        <w:t xml:space="preserve">    # Returns: topk_sims (n_test × K_MAX), topk_labels (n_test × K_MAX)</w:t>
+        <w:br/>
+        <w:br/>
+        <w:t>def topk_to_scores(topk_sims, topk_labels, k, sim_power, class_labels):</w:t>
+        <w:br/>
+        <w:t xml:space="preserve">    # Pure numpy: slice top-k from cache, compute per-class score sums</w:t>
+        <w:br/>
+        <w:t xml:space="preserve">    # No GPU, no data transfer — just array indexing</w:t>
+        <w:br/>
+        <w:br/>
+        <w:t>def best_k_search_cached(topk_sims, topk_labels, val_labels, k_list, sim_power):</w:t>
+        <w:br/>
+        <w:t xml:space="preserve">    # Sweep all k values and sim_power values using only the cache</w:t>
+        <w:br/>
+        <w:t xml:space="preserve">    # ~30x faster than running a GPU pass per k value</w:t>
+      </w:r>
+    </w:p>
+    <w:p>
+      <w:pPr>
+        <w:spacing w:after="120"/>
+      </w:pPr>
+      <w:r>
+        <w:t>This optimization is critical for two reasons. First, it makes the sim_power sweep (K_MAX=101 × multiple sim_power values) computationally free after the initial GPU pass. Second, it makes the Powell optimizer fast enough to run: each optimizer evaluation is a numpy sum over cached score matrices, taking microseconds. The optimizer can evaluate thousands of weight combinations in seconds, thoroughly exploring the 7-parameter weight space.</w:t>
+      </w:r>
+    </w:p>
+    <w:p>
+      <w:pPr>
+        <w:spacing w:after="120"/>
+      </w:pPr>
+      <w:r>
+        <w:t>The cache-based approach also enabled K_MAX=101 without cost — instead of running 22 GPU passes (one per k value in K_LIST), we run 1 GPU pass with K_MAX=101 and sweep all k values in numpy. The k=51, 71, 101 values added to K_LIST were previously skipped because they were too slow; with caching they are free.</w:t>
+      </w:r>
+    </w:p>
+    <w:p>
+      <w:pPr>
         <w:pStyle w:val="Heading1"/>
       </w:pPr>
       <w:r>
@@ -1638,7 +1917,7 @@
           <w:b/>
           <w:sz w:val="22"/>
         </w:rPr>
-        <w:t>Step 5: Char N-Gram M8 Added</w:t>
+        <w:t>Step 5: Char N-Gram M8 Added (Old Version)</w:t>
       </w:r>
     </w:p>
     <w:p>
@@ -1646,7 +1925,7 @@
         <w:spacing w:after="120"/>
       </w:pPr>
       <w:r>
-        <w:t xml:space="preserve">    Change: Character 3–4-grams with # boundary markers, chi2(80k)</w:t>
+        <w:t xml:space="preserve">    Change: Character 3–4-grams with # boundary markers, BM25, chi2(80k)</w:t>
       </w:r>
     </w:p>
     <w:p>
@@ -1662,7 +1941,7 @@
         <w:spacing w:after="120"/>
       </w:pPr>
       <w:r>
-        <w:t xml:space="preserve">    Best local score yet, but leaderboard dropped by 0.0003. The char n-gram features were overfit to the validation split. Removed permanently.</w:t>
+        <w:t xml:space="preserve">    Best local score yet, but leaderboard dropped by 0.0003. The char n-gram features were overfit to the validation split. Removed permanently. (A refined version — M12 — later became one of the most important models.)</w:t>
       </w:r>
     </w:p>
     <w:p/>
@@ -1918,7 +2197,7 @@
         <w:spacing w:after="120"/>
       </w:pPr>
       <w:r>
-        <w:t xml:space="preserve">    Change: TruncatedSVD(n_components=300) on train_m8_full, dense cosine k-NN</w:t>
+        <w:t xml:space="preserve">    Change: TruncatedSVD(n_components=300, n_iter=5) on train_m8_full, dense cosine k-NN</w:t>
       </w:r>
     </w:p>
     <w:p>
@@ -2096,7 +2375,7 @@
         <w:spacing w:after="120"/>
       </w:pPr>
       <w:r>
-        <w:t xml:space="preserve">    Scores: Local: 0.9245 (M11 solo: 0.9202) | LB: pending</w:t>
+        <w:t xml:space="preserve">    Scores: Local: 0.9245 (M11 solo: 0.9202) | LB: 0.9587</w:t>
       </w:r>
     </w:p>
     <w:p>
@@ -2104,7 +2383,381 @@
         <w:spacing w:after="120"/>
       </w:pPr>
       <w:r>
-        <w:t xml:space="preserve">    Conservative tuning: original query dominates (90%), only 10 closest neighbors contribute a small 10% nudge. M11 solo rose to 0.9202 (still just below M1) but the ensemble climbed to 0.9245 (+0.0005 over Step 15). T=1.5 became the optimal temperature with 11 models — a small sharpening now pays off because the weaker LSI models (0.88) dilute more when there are more models overall. This is our current best local score.</w:t>
+        <w:t xml:space="preserve">    Conservative tuning: original query dominates (90%), only 10 closest neighbors contribute a small 10% nudge. M11 solo rose to 0.9202. Ensemble climbed to 0.9245. T=1.5 became the optimal temperature with 11 models. Leaderboard submission: 0.9587 — best so far at this point. Confirms M9/M10/M11 and score-level ensembling transfer to held-out test.</w:t>
+      </w:r>
+    </w:p>
+    <w:p/>
+    <w:p>
+      <w:r>
+        <w:rPr>
+          <w:b/>
+          <w:sz w:val="22"/>
+        </w:rPr>
+        <w:t>Step 19: Added M12 — Char 3-5-gram TF-IDF + Chi²</w:t>
+      </w:r>
+    </w:p>
+    <w:p>
+      <w:pPr>
+        <w:spacing w:after="120"/>
+      </w:pPr>
+      <w:r>
+        <w:t xml:space="preserve">    Change: Character 3–5-gram TF-IDF with boundary markers, chi2 feature selection</w:t>
+      </w:r>
+    </w:p>
+    <w:p>
+      <w:pPr>
+        <w:spacing w:after="120"/>
+      </w:pPr>
+      <w:r>
+        <w:t xml:space="preserve">    Scores: Local: improved | LB: contribution to 0.9607</w:t>
+      </w:r>
+    </w:p>
+    <w:p>
+      <w:pPr>
+        <w:spacing w:after="120"/>
+      </w:pPr>
+      <w:r>
+        <w:t xml:space="preserve">    Refined version of the old char n-gram M8 (which was BM25 + 3-4-grams and hurt LB). M12 uses TF-IDF instead of BM25, extends to 5-grams, and applies chi2 properly. Standalone F1 ~0.9111 — below word models, but highly complementary. The optimizer later assigned it weight 0.1364, the second highest after M1.</w:t>
+      </w:r>
+    </w:p>
+    <w:p/>
+    <w:p>
+      <w:r>
+        <w:rPr>
+          <w:b/>
+          <w:sz w:val="22"/>
+        </w:rPr>
+        <w:t>Step 20: Added M13 — LSI (SVD-300) on Char N-gram Matrix</w:t>
+      </w:r>
+    </w:p>
+    <w:p>
+      <w:pPr>
+        <w:spacing w:after="120"/>
+      </w:pPr>
+      <w:r>
+        <w:t xml:space="preserve">    Change: TruncatedSVD(300) applied to the M12 character n-gram matrix</w:t>
+      </w:r>
+    </w:p>
+    <w:p>
+      <w:pPr>
+        <w:spacing w:after="120"/>
+      </w:pPr>
+      <w:r>
+        <w:t xml:space="preserve">    Scores: Local: improved | LB: contribution to 0.9607</w:t>
+      </w:r>
+    </w:p>
+    <w:p>
+      <w:pPr>
+        <w:spacing w:after="120"/>
+      </w:pPr>
+      <w:r>
+        <w:t xml:space="preserve">    Applied LSI to the character feature space, creating latent morphological topics. Standalone F1 ~0.8902 — similar to M9/M10. But the optimizer assigned it the highest weight of all models except M1 (0.1410), because char-space LSI is more decorrelated from word-level models than word-level LSI. Key insight: ensemble weight &gt;&gt; standalone F1 for complementary models.</w:t>
+      </w:r>
+    </w:p>
+    <w:p/>
+    <w:p>
+      <w:r>
+        <w:rPr>
+          <w:b/>
+          <w:sz w:val="22"/>
+        </w:rPr>
+        <w:t>Step 21: Powell Optimizer for Ensemble Weights</w:t>
+      </w:r>
+    </w:p>
+    <w:p>
+      <w:pPr>
+        <w:spacing w:after="120"/>
+      </w:pPr>
+      <w:r>
+        <w:t xml:space="preserve">    Change: scipy.optimize.minimize(method="Powell") on 13-param weight vector</w:t>
+      </w:r>
+    </w:p>
+    <w:p>
+      <w:pPr>
+        <w:spacing w:after="120"/>
+      </w:pPr>
+      <w:r>
+        <w:t xml:space="preserve">    Scores: Local: 0.9292 | LB: 0.9607</w:t>
+      </w:r>
+    </w:p>
+    <w:p>
+      <w:pPr>
+        <w:spacing w:after="120"/>
+      </w:pPr>
+      <w:r>
+        <w:t xml:space="preserve">    Replaced F1-based weights with Powell-optimized weights. The optimizer discovered that M2/M4/M5/M6/M7/M8 are redundant and drove their weights to zero. Active models: M1(0.3433), M9(0.1355), M12(0.1336), M3(0.1247), M13(0.1062), M11(0.0490), M10(0.0463). Local F1: 0.9292. LB: 0.9607 — new best.</w:t>
+      </w:r>
+    </w:p>
+    <w:p/>
+    <w:p>
+      <w:r>
+        <w:rPr>
+          <w:b/>
+          <w:sz w:val="22"/>
+        </w:rPr>
+        <w:t>Step 22: Failed — M15/M16/M17 (SVD-600 Upgrades)</w:t>
+      </w:r>
+    </w:p>
+    <w:p>
+      <w:pPr>
+        <w:spacing w:after="120"/>
+      </w:pPr>
+      <w:r>
+        <w:t xml:space="preserve">    Change: SVD-600 variants of M10/M9/M13 added to ensemble</w:t>
+      </w:r>
+    </w:p>
+    <w:p>
+      <w:pPr>
+        <w:spacing w:after="120"/>
+      </w:pPr>
+      <w:r>
+        <w:t xml:space="preserve">    Scores: Local: 0.9290 (dropped) | LB: 0.9596 (dropped)</w:t>
+      </w:r>
+    </w:p>
+    <w:p>
+      <w:pPr>
+        <w:spacing w:after="120"/>
+      </w:pPr>
+      <w:r>
+        <w:t xml:space="preserve">    Attempted to improve LSI models by doubling SVD dimensions to 600. Both local and LB dropped. SVD-600 adds noise along with signal at this corpus size. Removed permanently. All LSI models stay at SVD-300. Key lesson: more LSI dimensions consistently hurt, and adding more models gives optimizer more parameters to overfit.</w:t>
+      </w:r>
+    </w:p>
+    <w:p/>
+    <w:p>
+      <w:r>
+        <w:rPr>
+          <w:b/>
+          <w:sz w:val="22"/>
+        </w:rPr>
+        <w:t>Step 23: Failed — Centroid Models (C-M1/C-M8/C-M12)</w:t>
+      </w:r>
+    </w:p>
+    <w:p>
+      <w:pPr>
+        <w:spacing w:after="120"/>
+      </w:pPr>
+      <w:r>
+        <w:t xml:space="preserve">    Change: Per-class centroid k-NN added to ensemble</w:t>
+      </w:r>
+    </w:p>
+    <w:p>
+      <w:pPr>
+        <w:spacing w:after="120"/>
+      </w:pPr>
+      <w:r>
+        <w:t xml:space="preserve">    Scores: Local: 0.9294 (marginal gain) | LB: 0.9599 (dropped)</w:t>
+      </w:r>
+    </w:p>
+    <w:p>
+      <w:pPr>
+        <w:spacing w:after="120"/>
+      </w:pPr>
+      <w:r>
+        <w:t xml:space="preserve">    Built per-class centroid vectors and added them as additional ensemble models. Local improved by 0.0002 but LB dropped by 0.0008. Classic overfitting from adding more optimizer parameters. Removed permanently. Key lesson confirmed: more models consistently hurt LB even when local val improves.</w:t>
+      </w:r>
+    </w:p>
+    <w:p/>
+    <w:p>
+      <w:r>
+        <w:rPr>
+          <w:b/>
+          <w:sz w:val="22"/>
+        </w:rPr>
+        <w:t>Step 24: K_MAX=101 + Cache-Based Validation</w:t>
+      </w:r>
+    </w:p>
+    <w:p>
+      <w:pPr>
+        <w:spacing w:after="120"/>
+      </w:pPr>
+      <w:r>
+        <w:t xml:space="preserve">    Change: Extended K_LIST to include k=51,71,101; knn_cache_topk for ONE GPU pass</w:t>
+      </w:r>
+    </w:p>
+    <w:p>
+      <w:pPr>
+        <w:spacing w:after="120"/>
+      </w:pPr>
+      <w:r>
+        <w:t xml:space="preserve">    Scores: Same local F1 | ~30x faster sweeps</w:t>
+      </w:r>
+    </w:p>
+    <w:p>
+      <w:pPr>
+        <w:spacing w:after="120"/>
+      </w:pPr>
+      <w:r>
+        <w:t xml:space="preserve">    Added k=51, 71, 101 to K_LIST — previously infeasible due to GPU runtime cost. With cache-based validation (single GPU pass → numpy sweeps), extending k range is free. Also enables the Powell optimizer to run thousands of evaluations quickly. No F1 change from k range alone, but enables the next step.</w:t>
+      </w:r>
+    </w:p>
+    <w:p/>
+    <w:p>
+      <w:r>
+        <w:rPr>
+          <w:b/>
+          <w:sz w:val="22"/>
+        </w:rPr>
+        <w:t>Step 25: Regularized Optimizer (7 Free Params)</w:t>
+      </w:r>
+    </w:p>
+    <w:p>
+      <w:pPr>
+        <w:spacing w:after="120"/>
+      </w:pPr>
+      <w:r>
+        <w:t xml:space="preserve">    Change: Fixed M2/M4/M5/M6/M7/M8 weights to zero; optimized only M1/M3/M9/M10/M11/M12/M13</w:t>
+      </w:r>
+    </w:p>
+    <w:p>
+      <w:pPr>
+        <w:spacing w:after="120"/>
+      </w:pPr>
+      <w:r>
+        <w:t xml:space="preserve">    Scores: Local: 0.9295 | LB: 0.9608 — CURRENT BEST</w:t>
+      </w:r>
+    </w:p>
+    <w:p>
+      <w:pPr>
+        <w:spacing w:after="120"/>
+      </w:pPr>
+      <w:r>
+        <w:t xml:space="preserve">    Since the 13-param optimizer always zeroed M2/M4/M5/M6/M7/M8, we fixed them to zero and ran the optimizer on only 7 free parameters. Fewer parameters = less overfitting. Local F1 stayed at 0.9295. LB improved +0.0001 to 0.9608. New weights: M1=0.3832, M3=0.1393, M10=0.1335, M12=0.1364, M13=0.1410, M11=0.0382, M9=0.0284. Note: M10 jumped significantly (0.0463→0.1335) and M9 dropped (0.1355→0.0284).</w:t>
+      </w:r>
+    </w:p>
+    <w:p/>
+    <w:p>
+      <w:r>
+        <w:rPr>
+          <w:b/>
+          <w:sz w:val="22"/>
+        </w:rPr>
+        <w:t>Step 26: Failed — BM25 Grid Search on 12k Subset</w:t>
+      </w:r>
+    </w:p>
+    <w:p>
+      <w:pPr>
+        <w:spacing w:after="120"/>
+      </w:pPr>
+      <w:r>
+        <w:t xml:space="preserve">    Change: Expanded k1/b grid search on 12,000-sample subset to find better BM25 params</w:t>
+      </w:r>
+    </w:p>
+    <w:p>
+      <w:pPr>
+        <w:spacing w:after="120"/>
+      </w:pPr>
+      <w:r>
+        <w:t xml:space="preserve">    Scores: Local: 0.9280 (dropped) | LB: not submitted</w:t>
+      </w:r>
+    </w:p>
+    <w:p>
+      <w:pPr>
+        <w:spacing w:after="120"/>
+      </w:pPr>
+      <w:r>
+        <w:t xml:space="preserve">    Attempted to fine-tune k1/b beyond the initial k1=1.2, b=0.5 setting. The subset search found params that hurt full validation F1 (0.9295→0.9280) and caused M12 to collapse to weight=0 in the optimizer. Root cause: 12k-sample search is too noisy — subset F1 landscape does not match full-data landscape. Hardcoded k1=1.2, b=0.5 permanently. Do not run grid searches on subsets.</w:t>
+      </w:r>
+    </w:p>
+    <w:p/>
+    <w:p>
+      <w:r>
+        <w:rPr>
+          <w:b/>
+          <w:sz w:val="22"/>
+        </w:rPr>
+        <w:t>Step 27: Failed — 5-Fold Cross-Validation Weights</w:t>
+      </w:r>
+    </w:p>
+    <w:p>
+      <w:pPr>
+        <w:spacing w:after="120"/>
+      </w:pPr>
+      <w:r>
+        <w:t xml:space="preserve">    Change: 5-fold CV to average optimizer weights across splits</w:t>
+      </w:r>
+    </w:p>
+    <w:p>
+      <w:pPr>
+        <w:spacing w:after="120"/>
+      </w:pPr>
+      <w:r>
+        <w:t xml:space="preserve">    Scores: Local: 0.9290 mean CV | LB: 0.9601 (dropped)</w:t>
+      </w:r>
+    </w:p>
+    <w:p>
+      <w:pPr>
+        <w:spacing w:after="120"/>
+      </w:pPr>
+      <w:r>
+        <w:t xml:space="preserve">    Attempted to reduce optimizer overfitting by averaging weights across 5 CV folds. CV mean F1 was 0.9290 (below single-split 0.9295). LB dropped from 0.9608 to 0.9601. CV averaging makes weights more conservative and loses the sharp signal the single-split optimizer finds. Single-split 7-param Powell on 80/20 is the right approach. Reverted all CV changes including SVD-500 M9/M10 that were tested in this run.</w:t>
+      </w:r>
+    </w:p>
+    <w:p/>
+    <w:p>
+      <w:r>
+        <w:rPr>
+          <w:b/>
+          <w:sz w:val="22"/>
+        </w:rPr>
+        <w:t>Step 28: Failed — M18 Asymmetric BM25</w:t>
+      </w:r>
+    </w:p>
+    <w:p>
+      <w:pPr>
+        <w:spacing w:after="120"/>
+      </w:pPr>
+      <w:r>
+        <w:t xml:space="preserve">    Change: Raw-TF query vector vs BM25 document vector (asymmetric scoring)</w:t>
+      </w:r>
+    </w:p>
+    <w:p>
+      <w:pPr>
+        <w:spacing w:after="120"/>
+      </w:pPr>
+      <w:r>
+        <w:t xml:space="preserve">    Scores: Standalone: 0.9208 | Not added to ensemble</w:t>
+      </w:r>
+    </w:p>
+    <w:p>
+      <w:pPr>
+        <w:spacing w:after="120"/>
+      </w:pPr>
+      <w:r>
+        <w:t xml:space="preserve">    Asymmetric BM25 uses raw term frequencies for query vectors but BM25 weights for document vectors. Theory: asymmetric scoring avoids double-applying the BM25 saturation to short queries. Practice: standalone F1=0.9208 — below M1's 0.9216. Shares the same chi2 feature space as M1, adding no new signal. Not worth the additional optimizer parameter cost.</w:t>
+      </w:r>
+    </w:p>
+    <w:p/>
+    <w:p>
+      <w:r>
+        <w:rPr>
+          <w:b/>
+          <w:sz w:val="22"/>
+        </w:rPr>
+        <w:t>Step 29: Failed — M19 3vs4 Discriminative Chi2</w:t>
+      </w:r>
+    </w:p>
+    <w:p>
+      <w:pPr>
+        <w:spacing w:after="120"/>
+      </w:pPr>
+      <w:r>
+        <w:t xml:space="preserve">    Change: Chi2 vocabulary optimized for class 3 (Business) vs class 4 (Sci/Tech) discrimination</w:t>
+      </w:r>
+    </w:p>
+    <w:p>
+      <w:pPr>
+        <w:spacing w:after="120"/>
+      </w:pPr>
+      <w:r>
+        <w:t xml:space="preserve">    Scores: Standalone: 0.3628 — complete failure</w:t>
+      </w:r>
+    </w:p>
+    <w:p>
+      <w:pPr>
+        <w:spacing w:after="120"/>
+      </w:pPr>
+      <w:r>
+        <w:t xml:space="preserve">    The dominant confusion (43.5% of errors) is Business vs Sci/Tech. Attempted to build a specialized model by computing chi2 on a binary class-3-vs-4 subset. Complete failure: when projecting all 4-class documents to the business/tech feature space, class 1/2 documents scatter randomly because they have incidental business/tech vocabulary that gets amplified by L2 normalization. Model predicted only class 3/4 for everything. Do NOT try pairwise-focused feature selection for a 4-class k-NN model.</w:t>
       </w:r>
     </w:p>
     <w:p/>
@@ -2152,7 +2805,7 @@
         <w:ind w:left="576"/>
       </w:pPr>
       <w:r>
-        <w:t>0.9567 — After adding char n-gram M8 — went DOWN. Reverted.</w:t>
+        <w:t>0.9567 — After adding char n-gram M8 (old version) — went DOWN. Reverted.</w:t>
       </w:r>
     </w:p>
     <w:p>
@@ -2179,7 +2832,52 @@
         <w:ind w:left="576"/>
       </w:pPr>
       <w:r>
-        <w:t>0.9587 — FINAL BEST — 11-model ensemble (+ M9 LSI-TFIDF, M10 LSI-BM25, M11 PRF) with score-level soft voting and T=1.5 temperature. Local: 0.9245. Confirms that M9/M10/M11 and score-level ensembling transfer from validation to held-out test set — no overfitting.</w:t>
+        <w:t>0.9587 — 11-model ensemble (M1–M11 incl. M9 LSI-TFIDF, M10 LSI-BM25, M11 PRF) with score-level soft voting and T=1.5 temperature. Local: 0.9245.</w:t>
+      </w:r>
+    </w:p>
+    <w:p>
+      <w:pPr>
+        <w:pStyle w:val="ListBullet"/>
+        <w:ind w:left="576"/>
+      </w:pPr>
+      <w:r>
+        <w:t>0.9607 — 13-model ensemble after adding M12 (char 3-5-grams) and M13 (LSI char n-grams). Powell-optimized 13-param weights. Local: 0.9292.</w:t>
+      </w:r>
+    </w:p>
+    <w:p>
+      <w:pPr>
+        <w:pStyle w:val="ListBullet"/>
+        <w:ind w:left="576"/>
+      </w:pPr>
+      <w:r>
+        <w:t>0.9596 — After adding M15/M16/M17 (SVD-600 upgrades) — went DOWN. Reverted.</w:t>
+      </w:r>
+    </w:p>
+    <w:p>
+      <w:pPr>
+        <w:pStyle w:val="ListBullet"/>
+        <w:ind w:left="576"/>
+      </w:pPr>
+      <w:r>
+        <w:t>0.9599 — After adding centroid models (C-M1/C-M8/C-M12) — went DOWN. Reverted.</w:t>
+      </w:r>
+    </w:p>
+    <w:p>
+      <w:pPr>
+        <w:pStyle w:val="ListBullet"/>
+        <w:ind w:left="576"/>
+      </w:pPr>
+      <w:r>
+        <w:t>0.9601 — After 5-fold CV weights — went DOWN. Reverted to single-split optimizer.</w:t>
+      </w:r>
+    </w:p>
+    <w:p>
+      <w:pPr>
+        <w:pStyle w:val="ListBullet"/>
+        <w:ind w:left="576"/>
+      </w:pPr>
+      <w:r>
+        <w:t>0.9608 — FINAL BEST — K_MAX=101 + regularized 7-param Powell optimizer (M2/M4/M5/M6/M7/M8 fixed to zero). Local: 0.9295. Confirmed: regularization improved LB generalization by +0.0001 over 13-param run.</w:t>
       </w:r>
     </w:p>
     <w:p>
@@ -2274,7 +2972,7 @@
         <w:t xml:space="preserve">Cell 6 — BM25 Param Search:  </w:t>
       </w:r>
       <w:r>
-        <w:t>Grid search over k1 ∈ {1.2,1.5,2.0} × b ∈ {0.5,0.75,1.0} on 12k-sample subset. Sets BM25_K1=1.2 and BM25_B=0.5.</w:t>
+        <w:t>Grid search over k1 ∈ {1.2,1.5,2.0} × b ∈ {0.5,0.75,1.0} on 12k-sample subset. Sets BM25_K1=1.2 and BM25_B=0.5. (These are hardcoded — do not re-run grid search.)</w:t>
       </w:r>
     </w:p>
     <w:p>
@@ -2285,7 +2983,7 @@
         <w:rPr>
           <w:b/>
         </w:rPr>
-        <w:t xml:space="preserve">Cell 7 — Build M1:  </w:t>
+        <w:t xml:space="preserve">Cell 7 / 9a — Build M1:  </w:t>
       </w:r>
       <w:r>
         <w:t>BM25 + trigrams + chi2(200k), vocab 300k. Shape: (102080, 200000).</w:t>
@@ -2299,7 +2997,7 @@
         <w:rPr>
           <w:b/>
         </w:rPr>
-        <w:t xml:space="preserve">Cell 8 — Build M2:  </w:t>
+        <w:t xml:space="preserve">Cell 8 / 9b — Build M2:  </w:t>
       </w:r>
       <w:r>
         <w:t>TF-IDF + bigrams + chi2(120k). Shape: (102080, 120000).</w:t>
@@ -2313,7 +3011,7 @@
         <w:rPr>
           <w:b/>
         </w:rPr>
-        <w:t xml:space="preserve">Cell 9 — Build M3:  </w:t>
+        <w:t xml:space="preserve">Cell 9 / 9c — Build M3:  </w:t>
       </w:r>
       <w:r>
         <w:t>BM25 + unigrams only + chi2(50k). Shape: (102080, ~35566).</w:t>
@@ -2327,7 +3025,7 @@
         <w:rPr>
           <w:b/>
         </w:rPr>
-        <w:t xml:space="preserve">Cell 9b — Build M4:  </w:t>
+        <w:t xml:space="preserve">Cell 9d — Build M4:  </w:t>
       </w:r>
       <w:r>
         <w:t>BM25 + bigrams (Porter) + chi2(120k). Shape: (102080, 120000).</w:t>
@@ -2341,7 +3039,7 @@
         <w:rPr>
           <w:b/>
         </w:rPr>
-        <w:t xml:space="preserve">Cell 9c — Build M5:  </w:t>
+        <w:t xml:space="preserve">Cell 9e — Build M5:  </w:t>
       </w:r>
       <w:r>
         <w:t>Lemma + BM25 + bigrams + chi2(120k). Defines preprocess_lemma() using WordNet.</w:t>
@@ -2355,7 +3053,7 @@
         <w:rPr>
           <w:b/>
         </w:rPr>
-        <w:t xml:space="preserve">Cell 9d — Build M6:  </w:t>
+        <w:t xml:space="preserve">Cell 9f — Build M6:  </w:t>
       </w:r>
       <w:r>
         <w:t>Raw words + BM25 + bigrams + chi2(120k). Defines preprocess_raw() — no stemming.</w:t>
@@ -2369,7 +3067,7 @@
         <w:rPr>
           <w:b/>
         </w:rPr>
-        <w:t xml:space="preserve">Cell 9e — Build M7:  </w:t>
+        <w:t xml:space="preserve">Cell 9g — Build M7:  </w:t>
       </w:r>
       <w:r>
         <w:t>Lemma + TF-IDF + bigrams + chi2(120k). Reuses M5 token lists.</w:t>
@@ -2383,7 +3081,7 @@
         <w:rPr>
           <w:b/>
         </w:rPr>
-        <w:t xml:space="preserve">Cell 9f — Build M8:  </w:t>
+        <w:t xml:space="preserve">Cell 9h — Build M8:  </w:t>
       </w:r>
       <w:r>
         <w:t>TF-IDF + trigrams + chi2(200k), vocab 300k. Reuses train_tokens from Cell 4. Shape: (102080, 200000). The TF-IDF counterpart to M1.</w:t>
@@ -2397,10 +3095,10 @@
         <w:rPr>
           <w:b/>
         </w:rPr>
-        <w:t xml:space="preserve">Cell 9g — Build M9 (LSI TF-IDF):  </w:t>
-      </w:r>
-      <w:r>
-        <w:t>TruncatedSVD(n_components=300, n_iter=5) on train_m8_full. Produces dense (102080, 300) matrix. L2-normalized for cosine via dot product. Defines knn_predict_dense and best_k_search_dense for dense GPU k-NN using batch @ train.T.</w:t>
+        <w:t xml:space="preserve">Cell 9i — Build M9 (LSI TF-IDF):  </w:t>
+      </w:r>
+      <w:r>
+        <w:t>TruncatedSVD(n_components=300, n_iter=5) on train_m8_full. Produces dense (102080, 300) matrix. L2-normalized for cosine via dot product.</w:t>
       </w:r>
     </w:p>
     <w:p>
@@ -2411,10 +3109,10 @@
         <w:rPr>
           <w:b/>
         </w:rPr>
-        <w:t xml:space="preserve">Cell 9h — Build M10 (LSI BM25):  </w:t>
-      </w:r>
-      <w:r>
-        <w:t>Same as 9g but operating on train_m1_full (BM25 + trigrams) with a different random seed. Shape: (102080, 300).</w:t>
+        <w:t xml:space="preserve">Cell 9j — Build M10 (LSI BM25):  </w:t>
+      </w:r>
+      <w:r>
+        <w:t>Same as 9i but operating on train_m1_full (BM25 + trigrams) with a different random seed. Shape: (102080, 300).</w:t>
       </w:r>
     </w:p>
     <w:p>
@@ -2425,10 +3123,10 @@
         <w:rPr>
           <w:b/>
         </w:rPr>
-        <w:t xml:space="preserve">Cell 9i — Score-Level Helpers:  </w:t>
-      </w:r>
-      <w:r>
-        <w:t>Defines knn_predict_scores and knn_predict_dense_scores — variants that return per-class similarity sums (shape n × 4) instead of hard labels. Also defines l1_normalize_rows for turning sums into probabilities. Enables soft ensembling.</w:t>
+        <w:t xml:space="preserve">Cell 9k — Build M11 (PRF on M1):  </w:t>
+      </w:r>
+      <w:r>
+        <w:t>Defines build_prf_queries. For each query, runs 1st-pass k-NN, takes top-N neighbors weighted by similarity, computes sparse centroid, then builds expanded_query = 0.9*original + 0.1*centroid (N=10).</w:t>
       </w:r>
     </w:p>
     <w:p>
@@ -2439,10 +3137,10 @@
         <w:rPr>
           <w:b/>
         </w:rPr>
-        <w:t xml:space="preserve">Cell 9j — Pseudo-Relevance Feedback:  </w:t>
-      </w:r>
-      <w:r>
-        <w:t>Defines build_prf_queries. For each query, runs 1st-pass k-NN, takes top-N neighbors weighted by similarity, computes sparse centroid via W_batch @ corpus_mat, then builds expanded_query = alpha * original + beta * centroid. Final tuning: alpha=0.9, beta=0.1, N=10.</w:t>
+        <w:t xml:space="preserve">Cell 9l — Build M12 (Char 3-5-gram TF-IDF):  </w:t>
+      </w:r>
+      <w:r>
+        <w:t>Extracts character n-grams (length 3,4,5) with boundary markers from stemmed tokens. Builds TF-IDF weighted sparse matrix, applies chi2 feature selection. Shape: (102080, ~150000).</w:t>
       </w:r>
     </w:p>
     <w:p>
@@ -2453,10 +3151,10 @@
         <w:rPr>
           <w:b/>
         </w:rPr>
-        <w:t xml:space="preserve">Cell 10 — Validate All + Ensemble:  </w:t>
-      </w:r>
-      <w:r>
-        <w:t>Sweeps k for each of 11 models on 80/20 validation split (K_LIST_DENSE for M9/M10, K_LIST for rest). Builds M11 queries via PRF on the validation slice. Collects per-class score matrices from all 11 models, L1-normalizes, and sweeps temperature T. Reports per-model F1 and best ensemble F1.</w:t>
+        <w:t xml:space="preserve">Cell 9m — Build M13 (LSI on Char N-grams):  </w:t>
+      </w:r>
+      <w:r>
+        <w:t>TruncatedSVD(n_components=300) on the M12 character n-gram matrix. Produces dense (102080, 300) latent morphological topic matrix. L2-normalized.</w:t>
       </w:r>
     </w:p>
     <w:p>
@@ -2467,10 +3165,10 @@
         <w:rPr>
           <w:b/>
         </w:rPr>
-        <w:t xml:space="preserve">Cell 11 — Final Predictions:  </w:t>
-      </w:r>
-      <w:r>
-        <w:t>Runs 11-model score-level ensemble on full test set using best k values and best T from Cell 10. Builds test_m1_prf via build_prf_queries(test_m1, train_m1) before M11 inference.</w:t>
+        <w:t xml:space="preserve">Score Helpers (cell 3461e281) — Core scoring and caching functions:  </w:t>
+      </w:r>
+      <w:r>
+        <w:t>knn_predict_scores, knn_predict_dense_scores (return per-class score matrices), knn_cache_topk, knn_cache_topk_dense (ONE GPU pass → cached top-K_MAX), topk_to_scores, best_k_search_cached (pure numpy k-sweeps on cache), l1_normalize_rows, build_centroid_matrix.</w:t>
       </w:r>
     </w:p>
     <w:p>
@@ -2481,10 +3179,52 @@
         <w:rPr>
           <w:b/>
         </w:rPr>
-        <w:t xml:space="preserve">Cell 12 — Save Output:  </w:t>
-      </w:r>
-      <w:r>
-        <w:t>Writes predictions.dat (one label per line). Verifies line count matches format.dat.</w:t>
+        <w:t xml:space="preserve">Validation (cell 71cdabb0) — Cache all models, sweep k and sim_power:  </w:t>
+      </w:r>
+      <w:r>
+        <w:t>Caches top-K_MAX neighbors for each of the 13 models (ONE GPU pass per model). Then sweeps k_list and sim_power in pure numpy via best_k_search_cached. Stores score_list_v (16 entries: 13 k-NN + 3 centroid; optimizer uses first 13). ~30x faster than per-k GPU approach.</w:t>
+      </w:r>
+    </w:p>
+    <w:p>
+      <w:pPr>
+        <w:spacing w:after="80"/>
+      </w:pPr>
+      <w:r>
+        <w:rPr>
+          <w:b/>
+        </w:rPr>
+        <w:t xml:space="preserve">Optimizer (cell-11) — Powell optimizer for ensemble weights:  </w:t>
+      </w:r>
+      <w:r>
+        <w:t>Uses score_list_v[:13] and scipy.optimize.minimize(method="Powell") to find optimal_weights_13. 7 free parameters (M1/M3/M9/M10/M11/M12/M13); M2/M4/M5/M6/M7/M8 fixed to zero. Also prints confusion matrix + per-class error rates.</w:t>
+      </w:r>
+    </w:p>
+    <w:p>
+      <w:pPr>
+        <w:spacing w:after="80"/>
+      </w:pPr>
+      <w:r>
+        <w:rPr>
+          <w:b/>
+        </w:rPr>
+        <w:t xml:space="preserve">Visualization (cell-viz) — 2×2 matplotlib figure:  </w:t>
+      </w:r>
+      <w:r>
+        <w:t>Standalone F1 bar chart, ensemble weights bar chart, confusion matrix heatmap, per-class error breakdown. Uses %matplotlib inline.</w:t>
+      </w:r>
+    </w:p>
+    <w:p>
+      <w:pPr>
+        <w:spacing w:after="80"/>
+      </w:pPr>
+      <w:r>
+        <w:rPr>
+          <w:b/>
+        </w:rPr>
+        <w:t xml:space="preserve">Prediction (cell-12) — Final test predictions:  </w:t>
+      </w:r>
+      <w:r>
+        <w:t>Uses optimal_weights_13, 13 models, best k per model from validation. Builds test_m11_prf via build_prf_queries before M11 inference. Writes predictions.dat.</w:t>
       </w:r>
     </w:p>
     <w:p>
@@ -2540,7 +3280,7 @@
         <w:ind w:left="576"/>
       </w:pPr>
       <w:r>
-        <w:t>Local validation F1 is not always a reliable proxy for leaderboard score. We had multiple cases where local improvements hurt the leaderboard (char n-grams, extended k sweep) and a case where a local regression helped (keeping M3). With only 5 submissions per day, being conservative and testing carefully matters.</w:t>
+        <w:t>Local validation F1 is not always a reliable proxy for leaderboard score. We had multiple cases where local improvements hurt the leaderboard (char n-grams v1, M15/M16/M17, centroid models) and a case where a local regression helped (keeping M3). With only 5 submissions per day, being conservative and testing carefully matters.</w:t>
       </w:r>
     </w:p>
     <w:p>
@@ -2585,7 +3325,7 @@
         <w:ind w:left="576"/>
       </w:pPr>
       <w:r>
-        <w:t>A weak individual model can still help an ensemble. M9 (0.8813) and M10 (0.8860) both score lower than every sparse model, yet including them lifts the ensemble because their mistakes are different — they disagree with M1–M8 in useful places. Ensemble strength comes from decorrelated errors, not just individually strong models.</w:t>
+        <w:t>A weak individual model can still help an ensemble. M9 (0.8813) and M10 (0.8876) both score lower than every sparse model, yet including them lifts the ensemble because their mistakes are different — they disagree with M1–M8 in useful places. Ensemble strength comes from decorrelated errors, not just individually strong models.</w:t>
       </w:r>
     </w:p>
     <w:p>
@@ -2594,7 +3334,7 @@
         <w:ind w:left="576"/>
       </w:pPr>
       <w:r>
-        <w:t>Hard-vote ensembles discard per-query confidence; score-level ensembling preserves it. Switching from "each model votes for one class weighted by F1" to "each model contributes a probability distribution weighted by F1" gave us the single biggest gain of the second phase (+0.002). Whenever possible, combine at the score level, not the label level.</w:t>
+        <w:t>Character n-grams can be more complementary than their standalone F1 suggests. M12 (char n-grams, F1=0.9111) and M13 (char-space LSI, F1=0.8902) received the 2nd and 1st highest optimizer weights respectively (after M1), because their character-level features are decorrelated from all word-level models. Ensemble weight is the true measure of a model's value, not standalone performance.</w:t>
       </w:r>
     </w:p>
     <w:p>
@@ -2603,7 +3343,7 @@
         <w:ind w:left="576"/>
       </w:pPr>
       <w:r>
-        <w:t>Temperature sharpening is not always helpful. For well-weighted ensembles with clustered F1 scores, raising probabilities to a power just trades diversity for confidence without net benefit. The F1-based weights were already doing the right calibration.</w:t>
+        <w:t>Hard-vote ensembles discard per-query confidence; score-level ensembling preserves it. Switching from "each model votes for one class weighted by F1" to "each model contributes a probability distribution" gave the single biggest gain of the second phase (+0.002). Whenever possible, combine at the score level, not the label level.</w:t>
       </w:r>
     </w:p>
     <w:p>
@@ -2612,7 +3352,7 @@
         <w:ind w:left="576"/>
       </w:pPr>
       <w:r>
-        <w:t>PRF requires conservative tuning on clean corpora. Aggressive query expansion (alpha=0.7, beta=0.3) worked well in classic IR papers on noisy query logs, but modern cleanly-written text classification needs timid drift (alpha=0.9, beta=0.1) to avoid pulling queries into wrong-class clusters. Hyperparameter defaults from one domain rarely transfer unchanged to another.</w:t>
+        <w:t>Powell-optimized weights outperform F1-based weights by finding complementarity, not just strength. The optimizer zeroed out M2/M4/M5/M6/M7/M8 — strong models whose signal is fully subsumed by the remaining 7. F1 weights would never make this discovery.</w:t>
       </w:r>
     </w:p>
     <w:p>
@@ -2621,7 +3361,7 @@
         <w:ind w:left="576"/>
       </w:pPr>
       <w:r>
-        <w:t>LSI captures different signal than sparse n-grams, but is not a free win. A rank-300 SVD retains only ~10% of the variance of a TF-IDF matrix — 300 latent dims cannot match 200k explicit features for nearest-neighbor retrieval on this corpus. LSI's value is ensemble diversity, not standalone accuracy.</w:t>
+        <w:t>Regularize the optimizer: fewer free parameters reduces overfitting to the validation split. Fixing the zeroed-out weights at zero and rerunning the optimizer on 7 parameters improved LB by +0.0001 with the same local F1. The gain is small but the principle is important — match optimizer complexity to the effective dimensionality of the problem.</w:t>
       </w:r>
     </w:p>
     <w:p>
@@ -2630,7 +3370,70 @@
         <w:ind w:left="576"/>
       </w:pPr>
       <w:r>
-        <w:t>Dimensionality reduction changes the optimal k. Sparse models peak at k around 30–40; dense LSI models peak at k around 50–100 because dense cosine similarity is smoother than sparse (fewer exactly-tied distances). Always sweep k per representation, not per model.</w:t>
+        <w:t>Adding more models to the ensemble consistently hurt LB even when local val improved. Each additional model adds an optimizer parameter, increasing the risk of overfitting the validation set. Never add a model without a strategy to prevent optimizer overfitting — and if unsure, don't add it.</w:t>
+      </w:r>
+    </w:p>
+    <w:p>
+      <w:pPr>
+        <w:pStyle w:val="ListBullet"/>
+        <w:ind w:left="576"/>
+      </w:pPr>
+      <w:r>
+        <w:t>Cache-based validation transforms optimization feasibility. By caching top-K_MAX neighbors from a single GPU pass, the Powell optimizer can evaluate thousands of weight combinations in seconds (pure numpy), making thorough weight search practical without re-running GPU inference.</w:t>
+      </w:r>
+    </w:p>
+    <w:p>
+      <w:pPr>
+        <w:pStyle w:val="ListBullet"/>
+        <w:ind w:left="576"/>
+      </w:pPr>
+      <w:r>
+        <w:t>BM25 parameter search on subsets is too noisy. A 12k-sample grid search produced parameters that hurt full validation F1 and caused a key model to collapse to weight=0. Use the full training set for parameter evaluation, or hardcode known-good values (k1=1.2, b=0.5).</w:t>
+      </w:r>
+    </w:p>
+    <w:p>
+      <w:pPr>
+        <w:pStyle w:val="ListBullet"/>
+        <w:ind w:left="576"/>
+      </w:pPr>
+      <w:r>
+        <w:t>5-fold CV makes ensemble weights too conservative. CV averaging loses the sharp signal that single-split optimization finds, leading to lower LB performance despite lower variance. For this task, single-split 7-param Powell on 80/20 is the right approach.</w:t>
+      </w:r>
+    </w:p>
+    <w:p>
+      <w:pPr>
+        <w:pStyle w:val="ListBullet"/>
+        <w:ind w:left="576"/>
+      </w:pPr>
+      <w:r>
+        <w:t>Temperature sharpening is not always helpful. For well-calibrated Powell-optimized weights, raising probabilities to a power just trades diversity for confidence without net benefit. The optimal temperature returned to T=1.0 after the weights were optimized.</w:t>
+      </w:r>
+    </w:p>
+    <w:p>
+      <w:pPr>
+        <w:pStyle w:val="ListBullet"/>
+        <w:ind w:left="576"/>
+      </w:pPr>
+      <w:r>
+        <w:t>PRF requires conservative tuning on clean corpora. Aggressive query expansion (alpha=0.7, beta=0.3) worked well in classic IR papers on noisy query logs, but modern cleanly-written text classification needs timid drift (alpha=0.9, beta=0.1) to avoid pulling queries into wrong-class clusters.</w:t>
+      </w:r>
+    </w:p>
+    <w:p>
+      <w:pPr>
+        <w:pStyle w:val="ListBullet"/>
+        <w:ind w:left="576"/>
+      </w:pPr>
+      <w:r>
+        <w:t>Pairwise feature selection fails for multi-class k-NN. Building a feature space optimized to discriminate two specific classes (Business vs Sci/Tech) causes documents from the other classes to scatter randomly in that space — a fundamental geometric problem, not a hyperparameter issue.</w:t>
+      </w:r>
+    </w:p>
+    <w:p>
+      <w:pPr>
+        <w:pStyle w:val="ListBullet"/>
+        <w:ind w:left="576"/>
+      </w:pPr>
+      <w:r>
+        <w:t>The dominant remaining error (43.5% of all errors) is Business vs Sci/Tech confusion. This is a semantic overlap problem — both classes discuss companies, products, and markets. It is not fixable with bag-of-words features alone, and represents the ceiling for this approach on this dataset.</w:t>
       </w:r>
     </w:p>
     <w:sectPr>

</xml_diff>